<commit_message>
More work on Raisn river solutions
</commit_message>
<xml_diff>
--- a/canoeing/raisin_river_regression/RaisinRiver_Module_Worksheet.docx
+++ b/canoeing/raisin_river_regression/RaisinRiver_Module_Worksheet.docx
@@ -178,7 +178,6 @@
         </w:rPr>
         <w:t xml:space="preserve"> dataset </w:t>
       </w:r>
-      <w:proofErr w:type="gramStart"/>
       <w:r>
         <w:rPr>
           <w:rFonts w:ascii="Calibri" w:eastAsia="Calibri" w:hAnsi="Calibri" w:cs="Calibri"/>
@@ -195,42 +194,7 @@
           <w:sz w:val="24"/>
           <w:szCs w:val="24"/>
         </w:rPr>
-        <w:t xml:space="preserve"> </w:t>
-      </w:r>
-      <w:r>
-        <w:rPr>
-          <w:rFonts w:ascii="Calibri" w:eastAsia="Calibri" w:hAnsi="Calibri" w:cs="Calibri"/>
-          <w:sz w:val="24"/>
-          <w:szCs w:val="24"/>
-        </w:rPr>
-        <w:t>contains</w:t>
-      </w:r>
-      <w:proofErr w:type="gramEnd"/>
-      <w:r>
-        <w:rPr>
-          <w:rFonts w:ascii="Calibri" w:eastAsia="Calibri" w:hAnsi="Calibri" w:cs="Calibri"/>
-          <w:sz w:val="24"/>
-          <w:szCs w:val="24"/>
-        </w:rPr>
-        <w:t xml:space="preserve"> </w:t>
-      </w:r>
-      <w:proofErr w:type="spellStart"/>
-      <w:r>
-        <w:rPr>
-          <w:rFonts w:ascii="Calibri" w:eastAsia="Calibri" w:hAnsi="Calibri" w:cs="Calibri"/>
-          <w:sz w:val="24"/>
-          <w:szCs w:val="24"/>
-        </w:rPr>
-        <w:t>contains</w:t>
-      </w:r>
-      <w:proofErr w:type="spellEnd"/>
-      <w:r>
-        <w:rPr>
-          <w:rFonts w:ascii="Calibri" w:eastAsia="Calibri" w:hAnsi="Calibri" w:cs="Calibri"/>
-          <w:sz w:val="24"/>
-          <w:szCs w:val="24"/>
-        </w:rPr>
-        <w:t xml:space="preserve"> information on three variables for the Rasin River race for 9 years between 2015 and 2025 (excluding 2020 and 2021, when the race didn't run, and 2019, which has incomplete data).</w:t>
+        <w:t xml:space="preserve"> contains information on three variables for the Rasin River race for 9 years between 2015 and 2025 (excluding 2020 and 2021, when the race didn't run, and 2019, which has incomplete data).</w:t>
       </w:r>
     </w:p>
     <w:p>
@@ -474,7 +438,23 @@
           <w:sz w:val="24"/>
           <w:szCs w:val="24"/>
         </w:rPr>
-        <w:t>a scatterplot that shows flow rate as a predictor for proportion of DNF</w:t>
+        <w:t xml:space="preserve">a scatterplot </w:t>
+      </w:r>
+      <w:r>
+        <w:rPr>
+          <w:rFonts w:ascii="Calibri" w:eastAsia="Calibri" w:hAnsi="Calibri" w:cs="Calibri"/>
+          <w:sz w:val="24"/>
+          <w:szCs w:val="24"/>
+        </w:rPr>
+        <w:t xml:space="preserve">with regression line </w:t>
+      </w:r>
+      <w:r>
+        <w:rPr>
+          <w:rFonts w:ascii="Calibri" w:eastAsia="Calibri" w:hAnsi="Calibri" w:cs="Calibri"/>
+          <w:sz w:val="24"/>
+          <w:szCs w:val="24"/>
+        </w:rPr>
+        <w:t>that shows flow rate as a predictor for proportion of DNF</w:t>
       </w:r>
       <w:r>
         <w:rPr>
@@ -505,6 +485,14 @@
           <w:szCs w:val="24"/>
         </w:rPr>
         <w:t>Assess the fitted model</w:t>
+      </w:r>
+      <w:r>
+        <w:rPr>
+          <w:rFonts w:ascii="Calibri" w:eastAsia="Calibri" w:hAnsi="Calibri" w:cs="Calibri"/>
+          <w:sz w:val="24"/>
+          <w:szCs w:val="24"/>
+        </w:rPr>
+        <w:t>.</w:t>
       </w:r>
     </w:p>
     <w:p>
@@ -851,7 +839,15 @@
           <w:sz w:val="24"/>
           <w:szCs w:val="24"/>
         </w:rPr>
-        <w:t xml:space="preserve"> should show that the 2017 race with a flow rate of 2649 m</w:t>
+        <w:t xml:space="preserve"> should show that the 2017 race with a flow rate of 2649 </w:t>
+      </w:r>
+      <w:r>
+        <w:rPr>
+          <w:rFonts w:ascii="Calibri" w:eastAsia="Calibri" w:hAnsi="Calibri" w:cs="Calibri"/>
+          <w:sz w:val="24"/>
+          <w:szCs w:val="24"/>
+        </w:rPr>
+        <w:t>ft</w:t>
       </w:r>
       <w:r>
         <w:rPr>

</xml_diff>